<commit_message>
casos de uso (CU-00_1, CU-01 y actualizacion CU-RN-15)
</commit_message>
<xml_diff>
--- a/Documentación/casos-de-uso/15__Reglas_de_Negocio_CLIENTE.docx
+++ b/Documentación/casos-de-uso/15__Reglas_de_Negocio_CLIENTE.docx
@@ -55,12 +55,6 @@
         <w:gridCol w:w="2340"/>
       </w:tblGrid>
       <w:tr>
-        <w:tblPrEx>
-          <w:tblCellMar>
-            <w:top w:w="0" w:type="dxa"/>
-            <w:bottom w:w="0" w:type="dxa"/>
-          </w:tblCellMar>
-        </w:tblPrEx>
         <w:tc>
           <w:tcPr>
             <w:tcW w:w="2340" w:type="dxa"/>
@@ -183,12 +177,6 @@
         </w:tc>
       </w:tr>
       <w:tr>
-        <w:tblPrEx>
-          <w:tblCellMar>
-            <w:top w:w="0" w:type="dxa"/>
-            <w:bottom w:w="0" w:type="dxa"/>
-          </w:tblCellMar>
-        </w:tblPrEx>
         <w:tc>
           <w:tcPr>
             <w:tcW w:w="2340" w:type="dxa"/>
@@ -295,12 +283,6 @@
         </w:tc>
       </w:tr>
       <w:tr>
-        <w:tblPrEx>
-          <w:tblCellMar>
-            <w:top w:w="0" w:type="dxa"/>
-            <w:bottom w:w="0" w:type="dxa"/>
-          </w:tblCellMar>
-        </w:tblPrEx>
         <w:tc>
           <w:tcPr>
             <w:tcW w:w="2340" w:type="dxa"/>
@@ -483,12 +465,6 @@
         <w:gridCol w:w="1779"/>
       </w:tblGrid>
       <w:tr>
-        <w:tblPrEx>
-          <w:tblCellMar>
-            <w:top w:w="0" w:type="dxa"/>
-            <w:bottom w:w="0" w:type="dxa"/>
-          </w:tblCellMar>
-        </w:tblPrEx>
         <w:tc>
           <w:tcPr>
             <w:tcW w:w="909" w:type="dxa"/>
@@ -611,12 +587,6 @@
         </w:tc>
       </w:tr>
       <w:tr>
-        <w:tblPrEx>
-          <w:tblCellMar>
-            <w:top w:w="0" w:type="dxa"/>
-            <w:bottom w:w="0" w:type="dxa"/>
-          </w:tblCellMar>
-        </w:tblPrEx>
         <w:tc>
           <w:tcPr>
             <w:tcW w:w="909" w:type="dxa"/>
@@ -729,12 +699,6 @@
         </w:tc>
       </w:tr>
       <w:tr>
-        <w:tblPrEx>
-          <w:tblCellMar>
-            <w:top w:w="0" w:type="dxa"/>
-            <w:bottom w:w="0" w:type="dxa"/>
-          </w:tblCellMar>
-        </w:tblPrEx>
         <w:tc>
           <w:tcPr>
             <w:tcW w:w="909" w:type="dxa"/>
@@ -847,12 +811,6 @@
         </w:tc>
       </w:tr>
       <w:tr>
-        <w:tblPrEx>
-          <w:tblCellMar>
-            <w:top w:w="0" w:type="dxa"/>
-            <w:bottom w:w="0" w:type="dxa"/>
-          </w:tblCellMar>
-        </w:tblPrEx>
         <w:tc>
           <w:tcPr>
             <w:tcW w:w="909" w:type="dxa"/>
@@ -900,12 +858,7 @@
           </w:tcPr>
           <w:p>
             <w:r>
-              <w:rPr>
-                <w:color w:val="000000"/>
-                <w:sz w:val="18"/>
-                <w:szCs w:val="18"/>
-              </w:rPr>
-              <w:t>Seguridad en el registro de huella dactilar</w:t>
+              <w:t>Inicio de sesión valido</w:t>
             </w:r>
           </w:p>
         </w:tc>
@@ -932,7 +885,7 @@
                 <w:sz w:val="18"/>
                 <w:szCs w:val="18"/>
               </w:rPr>
-              <w:t>La huella dactilar del personal solo puede registrarse utilizando el lector físico autorizado por la clínica. No se permite cargar fotografías ni imágenes de huellas manualmente al sistema. Esta restricción aplica únicamente al personal; los pacientes no requieren registro biométrico.</w:t>
+              <w:t>El sistema no debe permitir iniciar sesión si existen campos marcados como obligatorios que estén vacíos.</w:t>
             </w:r>
           </w:p>
         </w:tc>
@@ -959,18 +912,12 @@
                 <w:sz w:val="18"/>
                 <w:szCs w:val="18"/>
               </w:rPr>
-              <w:t>CU-02, CU-00.1, CU-07</w:t>
+              <w:t>CU-001</w:t>
             </w:r>
           </w:p>
         </w:tc>
       </w:tr>
       <w:tr>
-        <w:tblPrEx>
-          <w:tblCellMar>
-            <w:top w:w="0" w:type="dxa"/>
-            <w:bottom w:w="0" w:type="dxa"/>
-          </w:tblCellMar>
-        </w:tblPrEx>
         <w:tc>
           <w:tcPr>
             <w:tcW w:w="909" w:type="dxa"/>
@@ -997,7 +944,6 @@
                 <w:sz w:val="18"/>
                 <w:szCs w:val="18"/>
               </w:rPr>
-              <w:lastRenderedPageBreak/>
               <w:t>RN04</w:t>
             </w:r>
           </w:p>
@@ -1088,12 +1034,6 @@
         </w:tc>
       </w:tr>
       <w:tr>
-        <w:tblPrEx>
-          <w:tblCellMar>
-            <w:top w:w="0" w:type="dxa"/>
-            <w:bottom w:w="0" w:type="dxa"/>
-          </w:tblCellMar>
-        </w:tblPrEx>
         <w:tc>
           <w:tcPr>
             <w:tcW w:w="909" w:type="dxa"/>
@@ -1119,6 +1059,7 @@
                 <w:sz w:val="18"/>
                 <w:szCs w:val="18"/>
               </w:rPr>
+              <w:lastRenderedPageBreak/>
               <w:t>RN05</w:t>
             </w:r>
           </w:p>
@@ -1206,12 +1147,6 @@
         </w:tc>
       </w:tr>
       <w:tr>
-        <w:tblPrEx>
-          <w:tblCellMar>
-            <w:top w:w="0" w:type="dxa"/>
-            <w:bottom w:w="0" w:type="dxa"/>
-          </w:tblCellMar>
-        </w:tblPrEx>
         <w:tc>
           <w:tcPr>
             <w:tcW w:w="909" w:type="dxa"/>
@@ -1324,12 +1259,6 @@
         </w:tc>
       </w:tr>
       <w:tr>
-        <w:tblPrEx>
-          <w:tblCellMar>
-            <w:top w:w="0" w:type="dxa"/>
-            <w:bottom w:w="0" w:type="dxa"/>
-          </w:tblCellMar>
-        </w:tblPrEx>
         <w:tc>
           <w:tcPr>
             <w:tcW w:w="909" w:type="dxa"/>
@@ -1442,12 +1371,6 @@
         </w:tc>
       </w:tr>
       <w:tr>
-        <w:tblPrEx>
-          <w:tblCellMar>
-            <w:top w:w="0" w:type="dxa"/>
-            <w:bottom w:w="0" w:type="dxa"/>
-          </w:tblCellMar>
-        </w:tblPrEx>
         <w:tc>
           <w:tcPr>
             <w:tcW w:w="909" w:type="dxa"/>
@@ -1560,12 +1483,6 @@
         </w:tc>
       </w:tr>
       <w:tr>
-        <w:tblPrEx>
-          <w:tblCellMar>
-            <w:top w:w="0" w:type="dxa"/>
-            <w:bottom w:w="0" w:type="dxa"/>
-          </w:tblCellMar>
-        </w:tblPrEx>
         <w:tc>
           <w:tcPr>
             <w:tcW w:w="909" w:type="dxa"/>
@@ -1678,12 +1595,6 @@
         </w:tc>
       </w:tr>
       <w:tr>
-        <w:tblPrEx>
-          <w:tblCellMar>
-            <w:top w:w="0" w:type="dxa"/>
-            <w:bottom w:w="0" w:type="dxa"/>
-          </w:tblCellMar>
-        </w:tblPrEx>
         <w:tc>
           <w:tcPr>
             <w:tcW w:w="909" w:type="dxa"/>
@@ -1796,12 +1707,6 @@
         </w:tc>
       </w:tr>
       <w:tr>
-        <w:tblPrEx>
-          <w:tblCellMar>
-            <w:top w:w="0" w:type="dxa"/>
-            <w:bottom w:w="0" w:type="dxa"/>
-          </w:tblCellMar>
-        </w:tblPrEx>
         <w:tc>
           <w:tcPr>
             <w:tcW w:w="909" w:type="dxa"/>
@@ -1914,12 +1819,6 @@
         </w:tc>
       </w:tr>
       <w:tr>
-        <w:tblPrEx>
-          <w:tblCellMar>
-            <w:top w:w="0" w:type="dxa"/>
-            <w:bottom w:w="0" w:type="dxa"/>
-          </w:tblCellMar>
-        </w:tblPrEx>
         <w:tc>
           <w:tcPr>
             <w:tcW w:w="909" w:type="dxa"/>
@@ -2032,12 +1931,6 @@
         </w:tc>
       </w:tr>
       <w:tr>
-        <w:tblPrEx>
-          <w:tblCellMar>
-            <w:top w:w="0" w:type="dxa"/>
-            <w:bottom w:w="0" w:type="dxa"/>
-          </w:tblCellMar>
-        </w:tblPrEx>
         <w:tc>
           <w:tcPr>
             <w:tcW w:w="909" w:type="dxa"/>
@@ -2150,12 +2043,6 @@
         </w:tc>
       </w:tr>
       <w:tr>
-        <w:tblPrEx>
-          <w:tblCellMar>
-            <w:top w:w="0" w:type="dxa"/>
-            <w:bottom w:w="0" w:type="dxa"/>
-          </w:tblCellMar>
-        </w:tblPrEx>
         <w:tc>
           <w:tcPr>
             <w:tcW w:w="909" w:type="dxa"/>
@@ -2181,7 +2068,6 @@
                 <w:sz w:val="18"/>
                 <w:szCs w:val="18"/>
               </w:rPr>
-              <w:lastRenderedPageBreak/>
               <w:t>RN14</w:t>
             </w:r>
           </w:p>
@@ -2269,12 +2155,6 @@
         </w:tc>
       </w:tr>
       <w:tr>
-        <w:tblPrEx>
-          <w:tblCellMar>
-            <w:top w:w="0" w:type="dxa"/>
-            <w:bottom w:w="0" w:type="dxa"/>
-          </w:tblCellMar>
-        </w:tblPrEx>
         <w:tc>
           <w:tcPr>
             <w:tcW w:w="909" w:type="dxa"/>
@@ -2300,6 +2180,7 @@
                 <w:sz w:val="18"/>
                 <w:szCs w:val="18"/>
               </w:rPr>
+              <w:lastRenderedPageBreak/>
               <w:t>RN15</w:t>
             </w:r>
           </w:p>
@@ -2354,7 +2235,25 @@
                 <w:sz w:val="18"/>
                 <w:szCs w:val="18"/>
               </w:rPr>
-              <w:t>La farmacia no puede entregar ningún medicamento si la receta no ha sido pagada previamente en caja. Ante cualquier intento de despacho sin pago, el sistema debe bloquear la operación y mostrar una alerta al farmacéutico para que oriente al paciente a realizar el pago.</w:t>
+              <w:t xml:space="preserve">La farmacia no puede entregar ningún medicamento si la receta no ha sido pagada previamente en </w:t>
+            </w:r>
+            <w:proofErr w:type="gramStart"/>
+            <w:r>
+              <w:rPr>
+                <w:color w:val="000000"/>
+                <w:sz w:val="18"/>
+                <w:szCs w:val="18"/>
+              </w:rPr>
+              <w:t>caja</w:t>
+            </w:r>
+            <w:proofErr w:type="gramEnd"/>
+            <w:r>
+              <w:rPr>
+                <w:color w:val="000000"/>
+                <w:sz w:val="18"/>
+                <w:szCs w:val="18"/>
+              </w:rPr>
+              <w:t>. Ante cualquier intento de despacho sin pago, el sistema debe bloquear la operación y mostrar una alerta al farmacéutico para que oriente al paciente a realizar el pago.</w:t>
             </w:r>
           </w:p>
         </w:tc>
@@ -2387,12 +2286,6 @@
         </w:tc>
       </w:tr>
       <w:tr>
-        <w:tblPrEx>
-          <w:tblCellMar>
-            <w:top w:w="0" w:type="dxa"/>
-            <w:bottom w:w="0" w:type="dxa"/>
-          </w:tblCellMar>
-        </w:tblPrEx>
         <w:tc>
           <w:tcPr>
             <w:tcW w:w="909" w:type="dxa"/>
@@ -2509,12 +2402,6 @@
         </w:tc>
       </w:tr>
       <w:tr>
-        <w:tblPrEx>
-          <w:tblCellMar>
-            <w:top w:w="0" w:type="dxa"/>
-            <w:bottom w:w="0" w:type="dxa"/>
-          </w:tblCellMar>
-        </w:tblPrEx>
         <w:tc>
           <w:tcPr>
             <w:tcW w:w="909" w:type="dxa"/>
@@ -2631,12 +2518,6 @@
         </w:tc>
       </w:tr>
       <w:tr>
-        <w:tblPrEx>
-          <w:tblCellMar>
-            <w:top w:w="0" w:type="dxa"/>
-            <w:bottom w:w="0" w:type="dxa"/>
-          </w:tblCellMar>
-        </w:tblPrEx>
         <w:tc>
           <w:tcPr>
             <w:tcW w:w="909" w:type="dxa"/>
@@ -2753,12 +2634,6 @@
         </w:tc>
       </w:tr>
       <w:tr>
-        <w:tblPrEx>
-          <w:tblCellMar>
-            <w:top w:w="0" w:type="dxa"/>
-            <w:bottom w:w="0" w:type="dxa"/>
-          </w:tblCellMar>
-        </w:tblPrEx>
         <w:tc>
           <w:tcPr>
             <w:tcW w:w="909" w:type="dxa"/>
@@ -2875,12 +2750,6 @@
         </w:tc>
       </w:tr>
       <w:tr>
-        <w:tblPrEx>
-          <w:tblCellMar>
-            <w:top w:w="0" w:type="dxa"/>
-            <w:bottom w:w="0" w:type="dxa"/>
-          </w:tblCellMar>
-        </w:tblPrEx>
         <w:tc>
           <w:tcPr>
             <w:tcW w:w="909" w:type="dxa"/>
@@ -2997,12 +2866,6 @@
         </w:tc>
       </w:tr>
       <w:tr>
-        <w:tblPrEx>
-          <w:tblCellMar>
-            <w:top w:w="0" w:type="dxa"/>
-            <w:bottom w:w="0" w:type="dxa"/>
-          </w:tblCellMar>
-        </w:tblPrEx>
         <w:tc>
           <w:tcPr>
             <w:tcW w:w="909" w:type="dxa"/>
@@ -3119,12 +2982,6 @@
         </w:tc>
       </w:tr>
       <w:tr>
-        <w:tblPrEx>
-          <w:tblCellMar>
-            <w:top w:w="0" w:type="dxa"/>
-            <w:bottom w:w="0" w:type="dxa"/>
-          </w:tblCellMar>
-        </w:tblPrEx>
         <w:tc>
           <w:tcPr>
             <w:tcW w:w="909" w:type="dxa"/>
@@ -3241,12 +3098,6 @@
         </w:tc>
       </w:tr>
       <w:tr>
-        <w:tblPrEx>
-          <w:tblCellMar>
-            <w:top w:w="0" w:type="dxa"/>
-            <w:bottom w:w="0" w:type="dxa"/>
-          </w:tblCellMar>
-        </w:tblPrEx>
         <w:tc>
           <w:tcPr>
             <w:tcW w:w="909" w:type="dxa"/>
@@ -3389,6 +3240,291 @@
               </w:rPr>
               <w:t>CU-00</w:t>
             </w:r>
+          </w:p>
+        </w:tc>
+      </w:tr>
+      <w:tr>
+        <w:tc>
+          <w:tcPr>
+            <w:tcW w:w="909" w:type="dxa"/>
+            <w:tcBorders>
+              <w:top w:val="single" w:sz="1" w:space="0" w:color="1D9E75"/>
+              <w:left w:val="single" w:sz="1" w:space="0" w:color="1D9E75"/>
+              <w:bottom w:val="single" w:sz="1" w:space="0" w:color="1D9E75"/>
+              <w:right w:val="single" w:sz="1" w:space="0" w:color="1D9E75"/>
+            </w:tcBorders>
+            <w:shd w:val="clear" w:color="auto" w:fill="E1F5EE"/>
+            <w:tcMar>
+              <w:top w:w="80" w:type="dxa"/>
+              <w:left w:w="100" w:type="dxa"/>
+              <w:bottom w:w="80" w:type="dxa"/>
+              <w:right w:w="100" w:type="dxa"/>
+            </w:tcMar>
+          </w:tcPr>
+          <w:p>
+            <w:pPr>
+              <w:rPr>
+                <w:b/>
+                <w:bCs/>
+                <w:color w:val="0F6E56"/>
+                <w:sz w:val="18"/>
+                <w:szCs w:val="18"/>
+              </w:rPr>
+            </w:pPr>
+            <w:r>
+              <w:rPr>
+                <w:b/>
+                <w:bCs/>
+                <w:color w:val="0F6E56"/>
+                <w:sz w:val="18"/>
+                <w:szCs w:val="18"/>
+              </w:rPr>
+              <w:t>RN24</w:t>
+            </w:r>
+          </w:p>
+        </w:tc>
+        <w:tc>
+          <w:tcPr>
+            <w:tcW w:w="1921" w:type="dxa"/>
+            <w:tcBorders>
+              <w:top w:val="single" w:sz="1" w:space="0" w:color="1D9E75"/>
+              <w:left w:val="single" w:sz="1" w:space="0" w:color="1D9E75"/>
+              <w:bottom w:val="single" w:sz="1" w:space="0" w:color="1D9E75"/>
+              <w:right w:val="single" w:sz="1" w:space="0" w:color="1D9E75"/>
+            </w:tcBorders>
+            <w:shd w:val="clear" w:color="auto" w:fill="E1F5EE"/>
+            <w:tcMar>
+              <w:top w:w="80" w:type="dxa"/>
+              <w:left w:w="100" w:type="dxa"/>
+              <w:bottom w:w="80" w:type="dxa"/>
+              <w:right w:w="100" w:type="dxa"/>
+            </w:tcMar>
+          </w:tcPr>
+          <w:p>
+            <w:pPr>
+              <w:rPr>
+                <w:color w:val="0F6E56"/>
+                <w:sz w:val="18"/>
+                <w:szCs w:val="18"/>
+              </w:rPr>
+            </w:pPr>
+            <w:r>
+              <w:rPr>
+                <w:color w:val="0F6E56"/>
+                <w:sz w:val="18"/>
+                <w:szCs w:val="18"/>
+              </w:rPr>
+              <w:t>Disponibilidad de código QR</w:t>
+            </w:r>
+          </w:p>
+        </w:tc>
+        <w:tc>
+          <w:tcPr>
+            <w:tcW w:w="4751" w:type="dxa"/>
+            <w:tcBorders>
+              <w:top w:val="single" w:sz="1" w:space="0" w:color="1D9E75"/>
+              <w:left w:val="single" w:sz="1" w:space="0" w:color="1D9E75"/>
+              <w:bottom w:val="single" w:sz="1" w:space="0" w:color="1D9E75"/>
+              <w:right w:val="single" w:sz="1" w:space="0" w:color="1D9E75"/>
+            </w:tcBorders>
+            <w:shd w:val="clear" w:color="auto" w:fill="E1F5EE"/>
+            <w:tcMar>
+              <w:top w:w="80" w:type="dxa"/>
+              <w:left w:w="100" w:type="dxa"/>
+              <w:bottom w:w="80" w:type="dxa"/>
+              <w:right w:w="100" w:type="dxa"/>
+            </w:tcMar>
+          </w:tcPr>
+          <w:p>
+            <w:pPr>
+              <w:rPr>
+                <w:color w:val="0F6E56"/>
+                <w:sz w:val="18"/>
+                <w:szCs w:val="18"/>
+              </w:rPr>
+            </w:pPr>
+            <w:r>
+              <w:rPr>
+                <w:color w:val="0F6E56"/>
+                <w:sz w:val="18"/>
+                <w:szCs w:val="18"/>
+              </w:rPr>
+              <w:t>El código QR generado al agendar una cita únicamente será vigente duran una hora previo a la cita y media hora posterior a la cita</w:t>
+            </w:r>
+          </w:p>
+        </w:tc>
+        <w:tc>
+          <w:tcPr>
+            <w:tcW w:w="1779" w:type="dxa"/>
+            <w:tcBorders>
+              <w:top w:val="single" w:sz="1" w:space="0" w:color="1D9E75"/>
+              <w:left w:val="single" w:sz="1" w:space="0" w:color="1D9E75"/>
+              <w:bottom w:val="single" w:sz="1" w:space="0" w:color="1D9E75"/>
+              <w:right w:val="single" w:sz="1" w:space="0" w:color="1D9E75"/>
+            </w:tcBorders>
+            <w:shd w:val="clear" w:color="auto" w:fill="E1F5EE"/>
+            <w:tcMar>
+              <w:top w:w="80" w:type="dxa"/>
+              <w:left w:w="100" w:type="dxa"/>
+              <w:bottom w:w="80" w:type="dxa"/>
+              <w:right w:w="100" w:type="dxa"/>
+            </w:tcMar>
+          </w:tcPr>
+          <w:p>
+            <w:pPr>
+              <w:rPr>
+                <w:color w:val="0F6E56"/>
+                <w:sz w:val="18"/>
+                <w:szCs w:val="18"/>
+              </w:rPr>
+            </w:pPr>
+            <w:r>
+              <w:rPr>
+                <w:color w:val="0F6E56"/>
+                <w:sz w:val="18"/>
+                <w:szCs w:val="18"/>
+              </w:rPr>
+              <w:t>CU-01</w:t>
+            </w:r>
+          </w:p>
+        </w:tc>
+      </w:tr>
+      <w:tr>
+        <w:tc>
+          <w:tcPr>
+            <w:tcW w:w="909" w:type="dxa"/>
+            <w:tcBorders>
+              <w:top w:val="single" w:sz="1" w:space="0" w:color="1D9E75"/>
+              <w:left w:val="single" w:sz="1" w:space="0" w:color="1D9E75"/>
+              <w:bottom w:val="single" w:sz="1" w:space="0" w:color="1D9E75"/>
+              <w:right w:val="single" w:sz="1" w:space="0" w:color="1D9E75"/>
+            </w:tcBorders>
+            <w:shd w:val="clear" w:color="auto" w:fill="E1F5EE"/>
+            <w:tcMar>
+              <w:top w:w="80" w:type="dxa"/>
+              <w:left w:w="100" w:type="dxa"/>
+              <w:bottom w:w="80" w:type="dxa"/>
+              <w:right w:w="100" w:type="dxa"/>
+            </w:tcMar>
+          </w:tcPr>
+          <w:p>
+            <w:pPr>
+              <w:rPr>
+                <w:b/>
+                <w:bCs/>
+                <w:color w:val="0F6E56"/>
+                <w:sz w:val="18"/>
+                <w:szCs w:val="18"/>
+              </w:rPr>
+            </w:pPr>
+            <w:r>
+              <w:rPr>
+                <w:b/>
+                <w:bCs/>
+                <w:color w:val="0F6E56"/>
+                <w:sz w:val="18"/>
+                <w:szCs w:val="18"/>
+              </w:rPr>
+              <w:lastRenderedPageBreak/>
+              <w:t>RN25</w:t>
+            </w:r>
+          </w:p>
+        </w:tc>
+        <w:tc>
+          <w:tcPr>
+            <w:tcW w:w="1921" w:type="dxa"/>
+            <w:tcBorders>
+              <w:top w:val="single" w:sz="1" w:space="0" w:color="1D9E75"/>
+              <w:left w:val="single" w:sz="1" w:space="0" w:color="1D9E75"/>
+              <w:bottom w:val="single" w:sz="1" w:space="0" w:color="1D9E75"/>
+              <w:right w:val="single" w:sz="1" w:space="0" w:color="1D9E75"/>
+            </w:tcBorders>
+            <w:shd w:val="clear" w:color="auto" w:fill="E1F5EE"/>
+            <w:tcMar>
+              <w:top w:w="80" w:type="dxa"/>
+              <w:left w:w="100" w:type="dxa"/>
+              <w:bottom w:w="80" w:type="dxa"/>
+              <w:right w:w="100" w:type="dxa"/>
+            </w:tcMar>
+          </w:tcPr>
+          <w:p>
+            <w:pPr>
+              <w:rPr>
+                <w:color w:val="0F6E56"/>
+                <w:sz w:val="18"/>
+                <w:szCs w:val="18"/>
+              </w:rPr>
+            </w:pPr>
+            <w:r>
+              <w:rPr>
+                <w:color w:val="0F6E56"/>
+                <w:sz w:val="18"/>
+                <w:szCs w:val="18"/>
+              </w:rPr>
+              <w:t>Gestión de Pago Cancelado o Insuficiente</w:t>
+            </w:r>
+          </w:p>
+        </w:tc>
+        <w:tc>
+          <w:tcPr>
+            <w:tcW w:w="4751" w:type="dxa"/>
+            <w:tcBorders>
+              <w:top w:val="single" w:sz="1" w:space="0" w:color="1D9E75"/>
+              <w:left w:val="single" w:sz="1" w:space="0" w:color="1D9E75"/>
+              <w:bottom w:val="single" w:sz="1" w:space="0" w:color="1D9E75"/>
+              <w:right w:val="single" w:sz="1" w:space="0" w:color="1D9E75"/>
+            </w:tcBorders>
+            <w:shd w:val="clear" w:color="auto" w:fill="E1F5EE"/>
+            <w:tcMar>
+              <w:top w:w="80" w:type="dxa"/>
+              <w:left w:w="100" w:type="dxa"/>
+              <w:bottom w:w="80" w:type="dxa"/>
+              <w:right w:w="100" w:type="dxa"/>
+            </w:tcMar>
+          </w:tcPr>
+          <w:p>
+            <w:pPr>
+              <w:rPr>
+                <w:color w:val="0F6E56"/>
+                <w:sz w:val="18"/>
+                <w:szCs w:val="18"/>
+              </w:rPr>
+            </w:pPr>
+            <w:r>
+              <w:rPr>
+                <w:color w:val="0F6E56"/>
+                <w:sz w:val="18"/>
+                <w:szCs w:val="18"/>
+              </w:rPr>
+              <w:t>Define la conducta que debe aplicar el sistema ante cualquier situación en la que un pago no pueda completarse, sea rechazado o esté ausente. Esta regla aplica en todos los módulos donde se realicen cobros y garantiza que ningún servicio de la clínica sea prestado, entregado o continuado sin el pago previo correspondiente. El comportamiento específico varía según el punto del proceso donde ocurra el fallo, pero en todos los casos el sistema debe detener la atención, informar al usuario responsable y mantener el registro del evento para su seguimiento.</w:t>
+            </w:r>
+          </w:p>
+        </w:tc>
+        <w:tc>
+          <w:tcPr>
+            <w:tcW w:w="1779" w:type="dxa"/>
+            <w:tcBorders>
+              <w:top w:val="single" w:sz="1" w:space="0" w:color="1D9E75"/>
+              <w:left w:val="single" w:sz="1" w:space="0" w:color="1D9E75"/>
+              <w:bottom w:val="single" w:sz="1" w:space="0" w:color="1D9E75"/>
+              <w:right w:val="single" w:sz="1" w:space="0" w:color="1D9E75"/>
+            </w:tcBorders>
+            <w:shd w:val="clear" w:color="auto" w:fill="E1F5EE"/>
+            <w:tcMar>
+              <w:top w:w="80" w:type="dxa"/>
+              <w:left w:w="100" w:type="dxa"/>
+              <w:bottom w:w="80" w:type="dxa"/>
+              <w:right w:w="100" w:type="dxa"/>
+            </w:tcMar>
+          </w:tcPr>
+          <w:p>
+            <w:pPr>
+              <w:rPr>
+                <w:color w:val="0F6E56"/>
+                <w:sz w:val="18"/>
+                <w:szCs w:val="18"/>
+              </w:rPr>
+            </w:pPr>
           </w:p>
         </w:tc>
       </w:tr>
@@ -4193,7 +4329,6 @@
   <w:style w:type="character" w:default="1" w:styleId="Fuentedeprrafopredeter">
     <w:name w:val="Default Paragraph Font"/>
     <w:uiPriority w:val="1"/>
-    <w:semiHidden/>
     <w:unhideWhenUsed/>
   </w:style>
   <w:style w:type="table" w:default="1" w:styleId="Tablanormal">

</xml_diff>

<commit_message>
casos de uso (CU faltantes)
</commit_message>
<xml_diff>
--- a/Documentación/casos-de-uso/15__Reglas_de_Negocio_CLIENTE.docx
+++ b/Documentación/casos-de-uso/15__Reglas_de_Negocio_CLIENTE.docx
@@ -3030,13 +3030,20 @@
             </w:tcMar>
           </w:tcPr>
           <w:p>
-            <w:r>
-              <w:rPr>
-                <w:color w:val="0F6E56"/>
-                <w:sz w:val="18"/>
-                <w:szCs w:val="18"/>
-              </w:rPr>
-              <w:t>Especialidad única para todos los médicos</w:t>
+            <w:pPr>
+              <w:rPr>
+                <w:color w:val="0F6E56"/>
+                <w:sz w:val="18"/>
+                <w:szCs w:val="18"/>
+              </w:rPr>
+            </w:pPr>
+            <w:r>
+              <w:rPr>
+                <w:color w:val="0F6E56"/>
+                <w:sz w:val="18"/>
+                <w:szCs w:val="18"/>
+              </w:rPr>
+              <w:t>Seguridad en el registro de huella dactilar</w:t>
             </w:r>
           </w:p>
         </w:tc>
@@ -3058,13 +3065,20 @@
             </w:tcMar>
           </w:tcPr>
           <w:p>
-            <w:r>
-              <w:rPr>
-                <w:color w:val="0F6E56"/>
-                <w:sz w:val="18"/>
-                <w:szCs w:val="18"/>
-              </w:rPr>
-              <w:t>Todos los médicos registrados en el sistema pertenecen a la especialidad de Medicina General. El sistema asigna esta especialidad de forma automática al registrar un médico y no permite modificarla desde ninguna pantalla.</w:t>
+            <w:pPr>
+              <w:rPr>
+                <w:color w:val="0F6E56"/>
+                <w:sz w:val="18"/>
+                <w:szCs w:val="18"/>
+              </w:rPr>
+            </w:pPr>
+            <w:r>
+              <w:rPr>
+                <w:color w:val="0F6E56"/>
+                <w:sz w:val="18"/>
+                <w:szCs w:val="18"/>
+              </w:rPr>
+              <w:t>La huella dactilar del personal solo puede registrarse utilizando el lector físico autorizado por la clínica. No se permite cargar fotografías ni imágenes de huellas manualmente al sistema. Esta restricción aplica únicamente al personal; los pacientes no requieren registro biométrico.</w:t>
             </w:r>
           </w:p>
         </w:tc>
@@ -4329,6 +4343,7 @@
   <w:style w:type="character" w:default="1" w:styleId="Fuentedeprrafopredeter">
     <w:name w:val="Default Paragraph Font"/>
     <w:uiPriority w:val="1"/>
+    <w:semiHidden/>
     <w:unhideWhenUsed/>
   </w:style>
   <w:style w:type="table" w:default="1" w:styleId="Tablanormal">

</xml_diff>